<commit_message>
Fecha a ultima afirmacao sem fonte: taxa consolidada do PRODES em 2012
O valor 4.571 km2 usado como ancora de 2012 era o unico numero publicado sem
fonte localizada. E a taxa consolidada divulgada pelo INPE em junho de 2013, 2%
abaixo da estimativa de dezembro de 2012 (4.656 km2) e a menor desde 1988.
Referencia acrescentada ao writing sample e ao relatorio estendido; o til de
aproximacao ("~4.571") removido, porque o numero deixou de ser aproximado.

Revisao de leitura dos tres documentos: sem paragrafo truncado, parenteses
desbalanceados, palavra repetida ou pontuacao solta; e sem conflito numerico
entre os tres (a unica ocorrencia de 56,2% e historica, na tabela de Registro
de Mudancas, descrevendo o que a quinta auditoria corrigiu).
</commit_message>
<xml_diff>
--- a/deliverables/EGMS_02_writing_sample.docx
+++ b/deliverables/EGMS_02_writing_sample.docx
@@ -2855,6 +2855,15 @@
       </w:pPr>
       <w:r>
         <w:t xml:space="preserve">BRASIL. Instituto Nacional de Pesquisas Espaciais (INPE). Nota técnica: estimativa de desmatamento na Amazônia Legal para 2025. São José dos Campos: INPE, 15 out. 2025. Disponível em: https://data.inpe.br/wp-content/uploads/sites/3/2025/10/20251015Nota_tecnica_EstimativaPRODES_2025_F.pdf. Acesso em: 27 jul. 2026.</w:t>
+      </w:r>
+    </w:p>
+    <w:p>
+      <w:pPr>
+        <w:spacing w:after="200" w:line="240" w:lineRule="auto"/>
+        <w:jc w:val="left"/>
+      </w:pPr>
+      <w:r>
+        <w:t xml:space="preserve">BRASIL. Instituto Nacional de Pesquisas Espaciais (INPE). Resultado consolidado do PRODES mostra redução de 29% no desmatamento na Amazônia em 2012. São José dos Campos: INPE, jun. 2013. Disponível em: http://www.inpe.br/noticias/noticia.php?Cod_Noticia=3301. Acesso em: 28 jul. 2026.</w:t>
       </w:r>
     </w:p>
     <w:p>

</xml_diff>